<commit_message>
mirror: sync depuis Delmat237/Yowyob-ERP-Accounting@frontend
</commit_message>
<xml_diff>
--- a/public/legal/terms.docx
+++ b/public/legal/terms.docx
@@ -1400,7 +1400,7 @@
                 <w:b/>
                 <w:sz w:val="15"/>
               </w:rPr>
-              <w:t>accounting.yowyob.com</w:t>
+              <w:t>accounting.yowyob.com/</w:t>
             </w:r>
           </w:p>
         </w:tc>
@@ -4293,7 +4293,7 @@
                 <w:b/>
                 <w:sz w:val="15"/>
               </w:rPr>
-              <w:t>accounting.yowyob.com</w:t>
+              <w:t>accounting.yowyob.com/</w:t>
             </w:r>
           </w:p>
         </w:tc>
@@ -6920,7 +6920,7 @@
                 <w:b/>
                 <w:sz w:val="15"/>
               </w:rPr>
-              <w:t>accounting.yowyob.com</w:t>
+              <w:t>accounting.yowyob.com/</w:t>
             </w:r>
           </w:p>
         </w:tc>

</xml_diff>